<commit_message>
Update & Make new TIs
</commit_message>
<xml_diff>
--- a/Documentation/Analysis/Task Informations/Complete/Team/Task Info WBS-39.docx
+++ b/Documentation/Analysis/Task Informations/Complete/Team/Task Info WBS-39.docx
@@ -2734,7 +2734,27 @@
         <w:rtl w:val="0"/>
         <w:lang w:val="en-US"/>
       </w:rPr>
-      <w:t>1405/NN/NN</w:t>
+      <w:t>1405/</w:t>
+    </w:r>
+    <w:r>
+      <w:rPr>
+        <w:rFonts w:ascii="Arial Unicode MS" w:cs="Zain Regular" w:hAnsi="Arial Unicode MS" w:eastAsia="Arial Unicode MS" w:hint="cs"/>
+        <w:rtl w:val="1"/>
+      </w:rPr>
+      <w:t>۳</w:t>
+    </w:r>
+    <w:r>
+      <w:rPr>
+        <w:rtl w:val="1"/>
+      </w:rPr>
+      <w:t>/</w:t>
+    </w:r>
+    <w:r>
+      <w:rPr>
+        <w:rFonts w:ascii="Arial Unicode MS" w:cs="Zain Regular" w:hAnsi="Arial Unicode MS" w:eastAsia="Arial Unicode MS" w:hint="cs"/>
+        <w:rtl w:val="1"/>
+      </w:rPr>
+      <w:t>۱۷</w:t>
     </w:r>
     <w:r>
       <w:rPr>

</xml_diff>